<commit_message>
docs(api): agregar URL productiva y ejemplos curl
</commit_message>
<xml_diff>
--- a/docs/Manual_Tecnico_Integracion_API_MsMall.docx
+++ b/docs/Manual_Tecnico_Integracion_API_MsMall.docx
@@ -456,7 +456,7 @@
           <w:rFonts w:ascii="Calibri" w:hAnsi="Calibri" w:eastAsia="Calibri"/>
           <w:color w:val="1B2533"/>
         </w:rPr>
-        <w:t>Complete el nombre del cliente, la URL del entorno, los identificadores mall_id/local_id y el contacto de soporte. Las credenciales se entregan por un canal seguro separado.</w:t>
+        <w:t>La URL productiva es https://msmall-02-production.up.railway.app. Complete el nombre del cliente, los identificadores mall_id/local_id y el contacto de soporte. Las credenciales se entregan por un canal seguro separado.</w:t>
       </w:r>
     </w:p>
     <w:p>
@@ -795,7 +795,7 @@
                 <w:color w:val="1B2533"/>
                 <w:sz w:val="18"/>
               </w:rPr>
-              <w:t>https://[URL-CERTIFICACION-MSMALL]</w:t>
+              <w:t>Será suministrada por MsMall si se habilita un ambiente de certificación</w:t>
             </w:r>
           </w:p>
         </w:tc>
@@ -850,7 +850,7 @@
                 <w:color w:val="1B2533"/>
                 <w:sz w:val="18"/>
               </w:rPr>
-              <w:t>https://[URL-PRODUCCION-MSMALL]</w:t>
+              <w:t>https://msmall-02-production.up.railway.app</w:t>
             </w:r>
           </w:p>
         </w:tc>
@@ -1845,7 +1845,7 @@
                 <w:color w:val="1B2533"/>
                 <w:sz w:val="17"/>
               </w:rPr>
-              <w:t>Dominio HTTPS del entorno</w:t>
+              <w:t>https://msmall-02-production.up.railway.app</w:t>
             </w:r>
           </w:p>
         </w:tc>
@@ -1870,7 +1870,7 @@
                 <w:color w:val="1B2533"/>
                 <w:sz w:val="17"/>
               </w:rPr>
-              <w:t>Configuración por ambiente</w:t>
+              <w:t>Producción</w:t>
             </w:r>
           </w:p>
         </w:tc>
@@ -2446,68 +2446,19 @@
           <w:color w:val="243447"/>
           <w:sz w:val="16"/>
         </w:rPr>
-        <w:t>POST {BASE_URL}/auth/token</w:t>
+        <w:t>POST https://msmall-02-production.up.railway.app/auth/token</w:t>
         <w:br/>
-      </w:r>
-      <w:r>
-        <w:rPr>
-          <w:rFonts w:ascii="Consolas" w:hAnsi="Consolas" w:eastAsia="Consolas"/>
-          <w:color w:val="243447"/>
-          <w:sz w:val="16"/>
-        </w:rPr>
         <w:t>Content-Type: application/json</w:t>
         <w:br/>
-      </w:r>
-      <w:r>
-        <w:rPr>
-          <w:rFonts w:ascii="Consolas" w:hAnsi="Consolas" w:eastAsia="Consolas"/>
-          <w:color w:val="243447"/>
-          <w:sz w:val="16"/>
-        </w:rPr>
         <w:br/>
-      </w:r>
-      <w:r>
-        <w:rPr>
-          <w:rFonts w:ascii="Consolas" w:hAnsi="Consolas" w:eastAsia="Consolas"/>
-          <w:color w:val="243447"/>
-          <w:sz w:val="16"/>
-        </w:rPr>
         <w:t>{</w:t>
         <w:br/>
-      </w:r>
-      <w:r>
-        <w:rPr>
-          <w:rFonts w:ascii="Consolas" w:hAnsi="Consolas" w:eastAsia="Consolas"/>
-          <w:color w:val="243447"/>
-          <w:sz w:val="16"/>
-        </w:rPr>
         <w:t xml:space="preserve">  "token_type": "exporter",</w:t>
         <w:br/>
-      </w:r>
-      <w:r>
-        <w:rPr>
-          <w:rFonts w:ascii="Consolas" w:hAnsi="Consolas" w:eastAsia="Consolas"/>
-          <w:color w:val="243447"/>
-          <w:sz w:val="16"/>
-        </w:rPr>
         <w:t xml:space="preserve">  "client_id": "{CLIENT_ID}",</w:t>
         <w:br/>
-      </w:r>
-      <w:r>
-        <w:rPr>
-          <w:rFonts w:ascii="Consolas" w:hAnsi="Consolas" w:eastAsia="Consolas"/>
-          <w:color w:val="243447"/>
-          <w:sz w:val="16"/>
-        </w:rPr>
         <w:t xml:space="preserve">  "client_secret": "{CLIENT_SECRET}"</w:t>
         <w:br/>
-      </w:r>
-      <w:r>
-        <w:rPr>
-          <w:rFonts w:ascii="Consolas" w:hAnsi="Consolas" w:eastAsia="Consolas"/>
-          <w:color w:val="243447"/>
-          <w:sz w:val="16"/>
-        </w:rPr>
         <w:t>}</w:t>
       </w:r>
     </w:p>
@@ -2740,50 +2691,15 @@
           <w:color w:val="243447"/>
           <w:sz w:val="16"/>
         </w:rPr>
-        <w:t>POST {BASE_URL}/auth/refresh</w:t>
+        <w:t>POST https://msmall-02-production.up.railway.app/auth/refresh</w:t>
         <w:br/>
-      </w:r>
-      <w:r>
-        <w:rPr>
-          <w:rFonts w:ascii="Consolas" w:hAnsi="Consolas" w:eastAsia="Consolas"/>
-          <w:color w:val="243447"/>
-          <w:sz w:val="16"/>
-        </w:rPr>
         <w:t>Content-Type: application/json</w:t>
         <w:br/>
-      </w:r>
-      <w:r>
-        <w:rPr>
-          <w:rFonts w:ascii="Consolas" w:hAnsi="Consolas" w:eastAsia="Consolas"/>
-          <w:color w:val="243447"/>
-          <w:sz w:val="16"/>
-        </w:rPr>
         <w:br/>
-      </w:r>
-      <w:r>
-        <w:rPr>
-          <w:rFonts w:ascii="Consolas" w:hAnsi="Consolas" w:eastAsia="Consolas"/>
-          <w:color w:val="243447"/>
-          <w:sz w:val="16"/>
-        </w:rPr>
         <w:t>{</w:t>
         <w:br/>
-      </w:r>
-      <w:r>
-        <w:rPr>
-          <w:rFonts w:ascii="Consolas" w:hAnsi="Consolas" w:eastAsia="Consolas"/>
-          <w:color w:val="243447"/>
-          <w:sz w:val="16"/>
-        </w:rPr>
         <w:t xml:space="preserve">  "refresh_token": "{REFRESH_TOKEN_ACTUAL}"</w:t>
         <w:br/>
-      </w:r>
-      <w:r>
-        <w:rPr>
-          <w:rFonts w:ascii="Consolas" w:hAnsi="Consolas" w:eastAsia="Consolas"/>
-          <w:color w:val="243447"/>
-          <w:sz w:val="16"/>
-        </w:rPr>
         <w:t>}</w:t>
       </w:r>
     </w:p>
@@ -2924,59 +2840,17 @@
           <w:color w:val="243447"/>
           <w:sz w:val="16"/>
         </w:rPr>
-        <w:t>POST {BASE_URL}/auth/revoke</w:t>
+        <w:t>POST https://msmall-02-production.up.railway.app/auth/revoke</w:t>
         <w:br/>
-      </w:r>
-      <w:r>
-        <w:rPr>
-          <w:rFonts w:ascii="Consolas" w:hAnsi="Consolas" w:eastAsia="Consolas"/>
-          <w:color w:val="243447"/>
-          <w:sz w:val="16"/>
-        </w:rPr>
         <w:t>Authorization: Bearer {ACCESS_TOKEN}</w:t>
         <w:br/>
-      </w:r>
-      <w:r>
-        <w:rPr>
-          <w:rFonts w:ascii="Consolas" w:hAnsi="Consolas" w:eastAsia="Consolas"/>
-          <w:color w:val="243447"/>
-          <w:sz w:val="16"/>
-        </w:rPr>
         <w:t>Content-Type: application/json</w:t>
         <w:br/>
-      </w:r>
-      <w:r>
-        <w:rPr>
-          <w:rFonts w:ascii="Consolas" w:hAnsi="Consolas" w:eastAsia="Consolas"/>
-          <w:color w:val="243447"/>
-          <w:sz w:val="16"/>
-        </w:rPr>
         <w:br/>
-      </w:r>
-      <w:r>
-        <w:rPr>
-          <w:rFonts w:ascii="Consolas" w:hAnsi="Consolas" w:eastAsia="Consolas"/>
-          <w:color w:val="243447"/>
-          <w:sz w:val="16"/>
-        </w:rPr>
         <w:t>{</w:t>
         <w:br/>
-      </w:r>
-      <w:r>
-        <w:rPr>
-          <w:rFonts w:ascii="Consolas" w:hAnsi="Consolas" w:eastAsia="Consolas"/>
-          <w:color w:val="243447"/>
-          <w:sz w:val="16"/>
-        </w:rPr>
         <w:t xml:space="preserve">  "reason": "device_reprovisioned"</w:t>
         <w:br/>
-      </w:r>
-      <w:r>
-        <w:rPr>
-          <w:rFonts w:ascii="Consolas" w:hAnsi="Consolas" w:eastAsia="Consolas"/>
-          <w:color w:val="243447"/>
-          <w:sz w:val="16"/>
-        </w:rPr>
         <w:t>}</w:t>
       </w:r>
     </w:p>
@@ -3186,7 +3060,7 @@
                 <w:color w:val="1B2533"/>
                 <w:sz w:val="18"/>
               </w:rPr>
-              <w:t>/api/v1/exporter/sync/ingest</w:t>
+              <w:t>https://msmall-02-production.up.railway.app/api/v1/exporter/sync/ingest</w:t>
             </w:r>
           </w:p>
         </w:tc>
@@ -3543,32 +3417,11 @@
           <w:color w:val="243447"/>
           <w:sz w:val="16"/>
         </w:rPr>
-        <w:t>GET {BASE_URL}/</w:t>
+        <w:t>GET https://msmall-02-production.up.railway.app/</w:t>
         <w:br/>
-      </w:r>
-      <w:r>
-        <w:rPr>
-          <w:rFonts w:ascii="Consolas" w:hAnsi="Consolas" w:eastAsia="Consolas"/>
-          <w:color w:val="243447"/>
-          <w:sz w:val="16"/>
-        </w:rPr>
         <w:br/>
-      </w:r>
-      <w:r>
-        <w:rPr>
-          <w:rFonts w:ascii="Consolas" w:hAnsi="Consolas" w:eastAsia="Consolas"/>
-          <w:color w:val="243447"/>
-          <w:sz w:val="16"/>
-        </w:rPr>
         <w:t>Respuesta esperada:</w:t>
         <w:br/>
-      </w:r>
-      <w:r>
-        <w:rPr>
-          <w:rFonts w:ascii="Consolas" w:hAnsi="Consolas" w:eastAsia="Consolas"/>
-          <w:color w:val="243447"/>
-          <w:sz w:val="16"/>
-        </w:rPr>
         <w:t>{"message":"MSMALL API is online","docs":"/docs"}</w:t>
       </w:r>
     </w:p>
@@ -11453,6 +11306,21 @@
       </w:r>
     </w:p>
     <w:p>
+      <w:pPr/>
+      <w:r>
+        <w:rPr>
+          <w:b/>
+        </w:rPr>
+        <w:t xml:space="preserve">URL base productiva: </w:t>
+      </w:r>
+      <w:r>
+        <w:t>https://msmall-02-production.up.railway.app</w:t>
+      </w:r>
+      <w:r>
+        <w:t>. Los valores entre llaves deben sustituirse por las credenciales e identificadores entregados por MsMall.</w:t>
+      </w:r>
+    </w:p>
+    <w:p>
       <w:pPr>
         <w:pStyle w:val="Heading2"/>
         <w:pageBreakBefore w:val="0"/>
@@ -11480,61 +11348,19 @@
           <w:color w:val="243447"/>
           <w:sz w:val="16"/>
         </w:rPr>
-        <w:t>curl --request POST '{BASE_URL}/auth/token' \</w:t>
+        <w:t>curl --request POST 'https://msmall-02-production.up.railway.app/auth/token' \</w:t>
         <w:br/>
-      </w:r>
-      <w:r>
-        <w:rPr>
-          <w:rFonts w:ascii="Consolas" w:hAnsi="Consolas" w:eastAsia="Consolas"/>
-          <w:color w:val="243447"/>
-          <w:sz w:val="16"/>
-        </w:rPr>
         <w:t xml:space="preserve">  --header 'Content-Type: application/json' \</w:t>
         <w:br/>
-      </w:r>
-      <w:r>
-        <w:rPr>
-          <w:rFonts w:ascii="Consolas" w:hAnsi="Consolas" w:eastAsia="Consolas"/>
-          <w:color w:val="243447"/>
-          <w:sz w:val="16"/>
-        </w:rPr>
         <w:t xml:space="preserve">  --data '{</w:t>
         <w:br/>
-      </w:r>
-      <w:r>
-        <w:rPr>
-          <w:rFonts w:ascii="Consolas" w:hAnsi="Consolas" w:eastAsia="Consolas"/>
-          <w:color w:val="243447"/>
-          <w:sz w:val="16"/>
-        </w:rPr>
         <w:t xml:space="preserve">    "token_type": "exporter",</w:t>
         <w:br/>
-      </w:r>
-      <w:r>
-        <w:rPr>
-          <w:rFonts w:ascii="Consolas" w:hAnsi="Consolas" w:eastAsia="Consolas"/>
-          <w:color w:val="243447"/>
-          <w:sz w:val="16"/>
-        </w:rPr>
         <w:t xml:space="preserve">    "client_id": "{CLIENT_ID}",</w:t>
         <w:br/>
-      </w:r>
-      <w:r>
-        <w:rPr>
-          <w:rFonts w:ascii="Consolas" w:hAnsi="Consolas" w:eastAsia="Consolas"/>
-          <w:color w:val="243447"/>
-          <w:sz w:val="16"/>
-        </w:rPr>
         <w:t xml:space="preserve">    "client_secret": "{CLIENT_SECRET}"</w:t>
         <w:br/>
-      </w:r>
-      <w:r>
-        <w:rPr>
-          <w:rFonts w:ascii="Consolas" w:hAnsi="Consolas" w:eastAsia="Consolas"/>
-          <w:color w:val="243447"/>
-          <w:sz w:val="16"/>
-        </w:rPr>
-        <w:t xml:space="preserve">  }'</w:t>
+        <w:t xml:space="preserve">  }' </w:t>
       </w:r>
     </w:p>
     <w:p>
@@ -11565,187 +11391,47 @@
           <w:color w:val="243447"/>
           <w:sz w:val="16"/>
         </w:rPr>
-        <w:t>curl --request POST '{BASE_URL}/api/v1/exporter/sync/ingest' \</w:t>
+        <w:t>curl --request POST 'https://msmall-02-production.up.railway.app/api/v1/exporter/sync/ingest' \</w:t>
         <w:br/>
-      </w:r>
-      <w:r>
-        <w:rPr>
-          <w:rFonts w:ascii="Consolas" w:hAnsi="Consolas" w:eastAsia="Consolas"/>
-          <w:color w:val="243447"/>
-          <w:sz w:val="16"/>
-        </w:rPr>
         <w:t xml:space="preserve">  --header 'Authorization: Bearer {ACCESS_TOKEN}' \</w:t>
         <w:br/>
-      </w:r>
-      <w:r>
-        <w:rPr>
-          <w:rFonts w:ascii="Consolas" w:hAnsi="Consolas" w:eastAsia="Consolas"/>
-          <w:color w:val="243447"/>
-          <w:sz w:val="16"/>
-        </w:rPr>
         <w:t xml:space="preserve">  --header 'Content-Type: application/json' \</w:t>
         <w:br/>
-      </w:r>
-      <w:r>
-        <w:rPr>
-          <w:rFonts w:ascii="Consolas" w:hAnsi="Consolas" w:eastAsia="Consolas"/>
-          <w:color w:val="243447"/>
-          <w:sz w:val="16"/>
-        </w:rPr>
         <w:t xml:space="preserve">  --data '{</w:t>
         <w:br/>
-      </w:r>
-      <w:r>
-        <w:rPr>
-          <w:rFonts w:ascii="Consolas" w:hAnsi="Consolas" w:eastAsia="Consolas"/>
-          <w:color w:val="243447"/>
-          <w:sz w:val="16"/>
-        </w:rPr>
         <w:t xml:space="preserve">    "mall_id": "{MALL_ID}",</w:t>
         <w:br/>
-      </w:r>
-      <w:r>
-        <w:rPr>
-          <w:rFonts w:ascii="Consolas" w:hAnsi="Consolas" w:eastAsia="Consolas"/>
-          <w:color w:val="243447"/>
-          <w:sz w:val="16"/>
-        </w:rPr>
         <w:t xml:space="preserve">    "local_id": "{LOCAL_ID}",</w:t>
         <w:br/>
-      </w:r>
-      <w:r>
-        <w:rPr>
-          <w:rFonts w:ascii="Consolas" w:hAnsi="Consolas" w:eastAsia="Consolas"/>
-          <w:color w:val="243447"/>
-          <w:sz w:val="16"/>
-        </w:rPr>
         <w:t xml:space="preserve">    "rows": [{</w:t>
         <w:br/>
-      </w:r>
-      <w:r>
-        <w:rPr>
-          <w:rFonts w:ascii="Consolas" w:hAnsi="Consolas" w:eastAsia="Consolas"/>
-          <w:color w:val="243447"/>
-          <w:sz w:val="16"/>
-        </w:rPr>
         <w:t xml:space="preserve">      "documento_tipo": "factura",</w:t>
         <w:br/>
-      </w:r>
-      <w:r>
-        <w:rPr>
-          <w:rFonts w:ascii="Consolas" w:hAnsi="Consolas" w:eastAsia="Consolas"/>
-          <w:color w:val="243447"/>
-          <w:sz w:val="16"/>
-        </w:rPr>
         <w:t xml:space="preserve">      "documento_numero": "F-1001",</w:t>
         <w:br/>
-      </w:r>
-      <w:r>
-        <w:rPr>
-          <w:rFonts w:ascii="Consolas" w:hAnsi="Consolas" w:eastAsia="Consolas"/>
-          <w:color w:val="243447"/>
-          <w:sz w:val="16"/>
-        </w:rPr>
         <w:t xml:space="preserve">      "fecha_venta": "2026-08-03",</w:t>
         <w:br/>
-      </w:r>
-      <w:r>
-        <w:rPr>
-          <w:rFonts w:ascii="Consolas" w:hAnsi="Consolas" w:eastAsia="Consolas"/>
-          <w:color w:val="243447"/>
-          <w:sz w:val="16"/>
-        </w:rPr>
         <w:t xml:space="preserve">      "hora_venta": "14:25:30",</w:t>
         <w:br/>
-      </w:r>
-      <w:r>
-        <w:rPr>
-          <w:rFonts w:ascii="Consolas" w:hAnsi="Consolas" w:eastAsia="Consolas"/>
-          <w:color w:val="243447"/>
-          <w:sz w:val="16"/>
-        </w:rPr>
         <w:t xml:space="preserve">      "total_bruto": 1180.00,</w:t>
         <w:br/>
-      </w:r>
-      <w:r>
-        <w:rPr>
-          <w:rFonts w:ascii="Consolas" w:hAnsi="Consolas" w:eastAsia="Consolas"/>
-          <w:color w:val="243447"/>
-          <w:sz w:val="16"/>
-        </w:rPr>
         <w:t xml:space="preserve">      "total_impuesto": 180.00,</w:t>
         <w:br/>
-      </w:r>
-      <w:r>
-        <w:rPr>
-          <w:rFonts w:ascii="Consolas" w:hAnsi="Consolas" w:eastAsia="Consolas"/>
-          <w:color w:val="243447"/>
-          <w:sz w:val="16"/>
-        </w:rPr>
         <w:t xml:space="preserve">      "total_neto": 1000.00</w:t>
         <w:br/>
-      </w:r>
-      <w:r>
-        <w:rPr>
-          <w:rFonts w:ascii="Consolas" w:hAnsi="Consolas" w:eastAsia="Consolas"/>
-          <w:color w:val="243447"/>
-          <w:sz w:val="16"/>
-        </w:rPr>
         <w:t xml:space="preserve">    }],</w:t>
         <w:br/>
-      </w:r>
-      <w:r>
-        <w:rPr>
-          <w:rFonts w:ascii="Consolas" w:hAnsi="Consolas" w:eastAsia="Consolas"/>
-          <w:color w:val="243447"/>
-          <w:sz w:val="16"/>
-        </w:rPr>
         <w:t xml:space="preserve">    "meta": {</w:t>
         <w:br/>
-      </w:r>
-      <w:r>
-        <w:rPr>
-          <w:rFonts w:ascii="Consolas" w:hAnsi="Consolas" w:eastAsia="Consolas"/>
-          <w:color w:val="243447"/>
-          <w:sz w:val="16"/>
-        </w:rPr>
         <w:t xml:space="preserve">      "contract_type": "msmall_sales_v1",</w:t>
         <w:br/>
-      </w:r>
-      <w:r>
-        <w:rPr>
-          <w:rFonts w:ascii="Consolas" w:hAnsi="Consolas" w:eastAsia="Consolas"/>
-          <w:color w:val="243447"/>
-          <w:sz w:val="16"/>
-        </w:rPr>
         <w:t xml:space="preserve">      "granularity": "transaction",</w:t>
         <w:br/>
-      </w:r>
-      <w:r>
-        <w:rPr>
-          <w:rFonts w:ascii="Consolas" w:hAnsi="Consolas" w:eastAsia="Consolas"/>
-          <w:color w:val="243447"/>
-          <w:sz w:val="16"/>
-        </w:rPr>
         <w:t xml:space="preserve">      "batch_id": "CLIENTE-20260803-001"</w:t>
         <w:br/>
-      </w:r>
-      <w:r>
-        <w:rPr>
-          <w:rFonts w:ascii="Consolas" w:hAnsi="Consolas" w:eastAsia="Consolas"/>
-          <w:color w:val="243447"/>
-          <w:sz w:val="16"/>
-        </w:rPr>
         <w:t xml:space="preserve">    }</w:t>
         <w:br/>
-      </w:r>
-      <w:r>
-        <w:rPr>
-          <w:rFonts w:ascii="Consolas" w:hAnsi="Consolas" w:eastAsia="Consolas"/>
-          <w:color w:val="243447"/>
-          <w:sz w:val="16"/>
-        </w:rPr>
-        <w:t xml:space="preserve">  }'</w:t>
+        <w:t xml:space="preserve">  }' </w:t>
       </w:r>
     </w:p>
     <w:p>
@@ -11776,25 +11462,48 @@
           <w:color w:val="243447"/>
           <w:sz w:val="16"/>
         </w:rPr>
-        <w:t>curl --request POST '{BASE_URL}/auth/refresh' \</w:t>
+        <w:t>curl --request POST 'https://msmall-02-production.up.railway.app/auth/refresh' \</w:t>
         <w:br/>
+        <w:t xml:space="preserve">  --header 'Content-Type: application/json' \</w:t>
+        <w:br/>
+        <w:t xml:space="preserve">  --data '{"refresh_token":"{REFRESH_TOKEN_ACTUAL}"}' </w:t>
       </w:r>
+    </w:p>
+    <w:p>
+      <w:pPr>
+        <w:pStyle w:val="Heading2"/>
+        <w:pageBreakBefore w:val="0"/>
+      </w:pPr>
+      <w:r>
+        <w:t>A.4 Revocar token</w:t>
+      </w:r>
+    </w:p>
+    <w:p>
+      <w:pPr>
+        <w:keepLines/>
+        <w:spacing w:before="80" w:after="160" w:line="240" w:lineRule="auto"/>
+        <w:ind w:left="115" w:right="115"/>
+        <w:shd w:fill="F5F7FA"/>
+        <w:pBdr>
+          <w:top w:val="single" w:sz="8" w:space="5" w:color="C8D2DF"/>
+          <w:left w:val="single" w:sz="8" w:space="5" w:color="C8D2DF"/>
+          <w:bottom w:val="single" w:sz="8" w:space="5" w:color="C8D2DF"/>
+          <w:right w:val="single" w:sz="8" w:space="5" w:color="C8D2DF"/>
+        </w:pBdr>
+      </w:pPr>
       <w:r>
         <w:rPr>
           <w:rFonts w:ascii="Consolas" w:hAnsi="Consolas" w:eastAsia="Consolas"/>
           <w:color w:val="243447"/>
           <w:sz w:val="16"/>
         </w:rPr>
+        <w:t>curl --request POST 'https://msmall-02-production.up.railway.app/auth/revoke' \</w:t>
+        <w:br/>
+        <w:t xml:space="preserve">  --header 'Authorization: Bearer {ACCESS_TOKEN}' \</w:t>
+        <w:br/>
         <w:t xml:space="preserve">  --header 'Content-Type: application/json' \</w:t>
         <w:br/>
-      </w:r>
-      <w:r>
-        <w:rPr>
-          <w:rFonts w:ascii="Consolas" w:hAnsi="Consolas" w:eastAsia="Consolas"/>
-          <w:color w:val="243447"/>
-          <w:sz w:val="16"/>
-        </w:rPr>
-        <w:t xml:space="preserve">  --data '{"refresh_token":"{REFRESH_TOKEN_ACTUAL}"}'</w:t>
+        <w:t xml:space="preserve">  --data '{"reason":"device_reprovisioned"}'</w:t>
       </w:r>
     </w:p>
     <w:p>
@@ -12452,7 +12161,7 @@
                 <w:color w:val="1B2533"/>
                 <w:sz w:val="18"/>
               </w:rPr>
-              <w:t>____________________________________________</w:t>
+              <w:t>https://msmall-02-production.up.railway.app</w:t>
             </w:r>
           </w:p>
         </w:tc>

</xml_diff>